<commit_message>
Minor updates to documentation file
</commit_message>
<xml_diff>
--- a/LHJ Data/documentation/Documentation - PopDaWG LHJ ARS Population File.docx
+++ b/LHJ Data/documentation/Documentation - PopDaWG LHJ ARS Population File.docx
@@ -1122,7 +1122,21 @@
           <w:rStyle w:val="normaltextrun"/>
           <w:rFonts w:ascii="Century Gothic" w:eastAsiaTheme="majorEastAsia" w:hAnsi="Century Gothic" w:cs="Segoe UI"/>
         </w:rPr>
-        <w:t xml:space="preserve"> (Population Data Work Group) Local Health Jurisdiction (LHJ) Age-Race-Sex Population file.</w:t>
+        <w:t xml:space="preserve"> (Population Data Work Group) Local Health Jurisdiction (LHJ) Age-Race-Sex</w:t>
+      </w:r>
+      <w:r>
+        <w:rPr>
+          <w:rStyle w:val="normaltextrun"/>
+          <w:rFonts w:ascii="Century Gothic" w:eastAsiaTheme="majorEastAsia" w:hAnsi="Century Gothic" w:cs="Segoe UI"/>
+        </w:rPr>
+        <w:t xml:space="preserve"> (ARS)</w:t>
+      </w:r>
+      <w:r>
+        <w:rPr>
+          <w:rStyle w:val="normaltextrun"/>
+          <w:rFonts w:ascii="Century Gothic" w:eastAsiaTheme="majorEastAsia" w:hAnsi="Century Gothic" w:cs="Segoe UI"/>
+        </w:rPr>
+        <w:t xml:space="preserve"> Population file.</w:t>
       </w:r>
     </w:p>
     <w:p>
@@ -1210,7 +1224,23 @@
           <w:rStyle w:val="normaltextrun"/>
           <w:rFonts w:ascii="Century Gothic" w:eastAsiaTheme="majorEastAsia" w:hAnsi="Century Gothic" w:cs="Segoe UI"/>
         </w:rPr>
-        <w:t xml:space="preserve">A table of the population file’s versions. </w:t>
+        <w:t xml:space="preserve">Differences between the </w:t>
+      </w:r>
+      <w:proofErr w:type="spellStart"/>
+      <w:r>
+        <w:rPr>
+          <w:rStyle w:val="normaltextrun"/>
+          <w:rFonts w:ascii="Century Gothic" w:eastAsiaTheme="majorEastAsia" w:hAnsi="Century Gothic" w:cs="Segoe UI"/>
+        </w:rPr>
+        <w:t>PopDaWG</w:t>
+      </w:r>
+      <w:proofErr w:type="spellEnd"/>
+      <w:r>
+        <w:rPr>
+          <w:rStyle w:val="normaltextrun"/>
+          <w:rFonts w:ascii="Century Gothic" w:eastAsiaTheme="majorEastAsia" w:hAnsi="Century Gothic" w:cs="Segoe UI"/>
+        </w:rPr>
+        <w:t xml:space="preserve"> LHJ ARS Population file and Department of Finance (DOF) P3 file</w:t>
       </w:r>
     </w:p>
     <w:p>
@@ -1233,6 +1263,28 @@
           <w:rFonts w:ascii="Century Gothic" w:eastAsiaTheme="majorEastAsia" w:hAnsi="Century Gothic" w:cs="Segoe UI"/>
         </w:rPr>
         <w:lastRenderedPageBreak/>
+        <w:t xml:space="preserve">A table of the population file’s versions. </w:t>
+      </w:r>
+    </w:p>
+    <w:p>
+      <w:pPr>
+        <w:pStyle w:val="paragraph"/>
+        <w:numPr>
+          <w:ilvl w:val="0"/>
+          <w:numId w:val="25"/>
+        </w:numPr>
+        <w:spacing w:before="0" w:beforeAutospacing="0" w:after="0" w:afterAutospacing="0"/>
+        <w:textAlignment w:val="baseline"/>
+        <w:rPr>
+          <w:rStyle w:val="normaltextrun"/>
+          <w:rFonts w:ascii="Century Gothic" w:eastAsiaTheme="majorEastAsia" w:hAnsi="Century Gothic" w:cs="Segoe UI"/>
+        </w:rPr>
+      </w:pPr>
+      <w:r>
+        <w:rPr>
+          <w:rStyle w:val="normaltextrun"/>
+          <w:rFonts w:ascii="Century Gothic" w:eastAsiaTheme="majorEastAsia" w:hAnsi="Century Gothic" w:cs="Segoe UI"/>
+        </w:rPr>
         <w:t xml:space="preserve">Changelog: A chronological list of notable changes and updates to the population file. </w:t>
       </w:r>
     </w:p>
@@ -1305,7 +1357,25 @@
           <w:b/>
           <w:bCs/>
         </w:rPr>
-        <w:t xml:space="preserve"> Local Health Jurisdiction (LHJ) Age-Race-Sex Population file</w:t>
+        <w:t xml:space="preserve"> Local Health Jurisdiction (LHJ) Age-Race-Sex</w:t>
+      </w:r>
+      <w:r>
+        <w:rPr>
+          <w:rStyle w:val="normaltextrun"/>
+          <w:rFonts w:ascii="Century Gothic" w:eastAsiaTheme="majorEastAsia" w:hAnsi="Century Gothic" w:cs="Segoe UI"/>
+          <w:b/>
+          <w:bCs/>
+        </w:rPr>
+        <w:t xml:space="preserve"> (ARS)</w:t>
+      </w:r>
+      <w:r>
+        <w:rPr>
+          <w:rStyle w:val="normaltextrun"/>
+          <w:rFonts w:ascii="Century Gothic" w:eastAsiaTheme="majorEastAsia" w:hAnsi="Century Gothic" w:cs="Segoe UI"/>
+          <w:b/>
+          <w:bCs/>
+        </w:rPr>
+        <w:t xml:space="preserve"> Population file</w:t>
       </w:r>
       <w:r>
         <w:rPr>
@@ -1314,6 +1384,112 @@
         </w:rPr>
         <w:t xml:space="preserve"> is the preferred file for population demographic statistics and population-based rate calculations at the California Department of Public Health (CDPH). This file was developed through a collaborative, methodologically rigorous process involving data experts from across CDPH. It integrates conventional data sources and applies standardized methods to produce annual population estimates by single years of age, race/ethnicity, sex, and county/LHJ.</w:t>
       </w:r>
+    </w:p>
+    <w:p>
+      <w:pPr>
+        <w:pStyle w:val="paragraph"/>
+        <w:spacing w:before="0" w:beforeAutospacing="0" w:after="0" w:afterAutospacing="0"/>
+        <w:textAlignment w:val="baseline"/>
+        <w:rPr>
+          <w:rStyle w:val="normaltextrun"/>
+          <w:rFonts w:ascii="Century Gothic" w:eastAsiaTheme="majorEastAsia" w:hAnsi="Century Gothic" w:cs="Segoe UI"/>
+        </w:rPr>
+      </w:pPr>
+    </w:p>
+    <w:p>
+      <w:pPr>
+        <w:pStyle w:val="paragraph"/>
+        <w:spacing w:before="0" w:beforeAutospacing="0" w:after="0" w:afterAutospacing="0"/>
+        <w:textAlignment w:val="baseline"/>
+        <w:rPr>
+          <w:rStyle w:val="normaltextrun"/>
+          <w:rFonts w:ascii="Century Gothic" w:eastAsiaTheme="majorEastAsia" w:hAnsi="Century Gothic" w:cs="Segoe UI"/>
+        </w:rPr>
+      </w:pPr>
+      <w:r>
+        <w:rPr>
+          <w:rStyle w:val="normaltextrun"/>
+          <w:rFonts w:ascii="Century Gothic" w:eastAsiaTheme="majorEastAsia" w:hAnsi="Century Gothic" w:cs="Segoe UI"/>
+        </w:rPr>
+        <w:t xml:space="preserve">The </w:t>
+      </w:r>
+      <w:proofErr w:type="spellStart"/>
+      <w:r>
+        <w:rPr>
+          <w:rStyle w:val="normaltextrun"/>
+          <w:rFonts w:ascii="Century Gothic" w:eastAsiaTheme="majorEastAsia" w:hAnsi="Century Gothic" w:cs="Segoe UI"/>
+          <w:b/>
+          <w:bCs/>
+        </w:rPr>
+        <w:t>PopDaWG</w:t>
+      </w:r>
+      <w:proofErr w:type="spellEnd"/>
+      <w:r>
+        <w:rPr>
+          <w:rStyle w:val="normaltextrun"/>
+          <w:rFonts w:ascii="Century Gothic" w:eastAsiaTheme="majorEastAsia" w:hAnsi="Century Gothic" w:cs="Segoe UI"/>
+          <w:b/>
+          <w:bCs/>
+        </w:rPr>
+        <w:t xml:space="preserve"> LHJ ARS Population file</w:t>
+      </w:r>
+      <w:r>
+        <w:rPr>
+          <w:rStyle w:val="normaltextrun"/>
+          <w:rFonts w:ascii="Century Gothic" w:eastAsiaTheme="majorEastAsia" w:hAnsi="Century Gothic" w:cs="Segoe UI"/>
+        </w:rPr>
+        <w:t xml:space="preserve"> </w:t>
+      </w:r>
+      <w:r>
+        <w:rPr>
+          <w:rStyle w:val="normaltextrun"/>
+          <w:rFonts w:ascii="Century Gothic" w:eastAsiaTheme="majorEastAsia" w:hAnsi="Century Gothic" w:cs="Segoe UI"/>
+        </w:rPr>
+        <w:t xml:space="preserve">can be found at the </w:t>
+      </w:r>
+      <w:proofErr w:type="spellStart"/>
+      <w:r>
+        <w:rPr>
+          <w:rStyle w:val="normaltextrun"/>
+          <w:rFonts w:ascii="Century Gothic" w:eastAsiaTheme="majorEastAsia" w:hAnsi="Century Gothic" w:cs="Segoe UI"/>
+        </w:rPr>
+        <w:t>CalHHS</w:t>
+      </w:r>
+      <w:proofErr w:type="spellEnd"/>
+      <w:r>
+        <w:rPr>
+          <w:rStyle w:val="normaltextrun"/>
+          <w:rFonts w:ascii="Century Gothic" w:eastAsiaTheme="majorEastAsia" w:hAnsi="Century Gothic" w:cs="Segoe UI"/>
+        </w:rPr>
+        <w:t xml:space="preserve"> Open Data Portal</w:t>
+      </w:r>
+      <w:r>
+        <w:rPr>
+          <w:rStyle w:val="normaltextrun"/>
+          <w:rFonts w:ascii="Century Gothic" w:eastAsiaTheme="majorEastAsia" w:hAnsi="Century Gothic" w:cs="Segoe UI"/>
+        </w:rPr>
+        <w:t xml:space="preserve">: </w:t>
+      </w:r>
+      <w:hyperlink r:id="rId5" w:history="1">
+        <w:r>
+          <w:rPr>
+            <w:rStyle w:val="Hyperlink"/>
+            <w:rFonts w:ascii="Century Gothic" w:eastAsiaTheme="majorEastAsia" w:hAnsi="Century Gothic" w:cs="Segoe UI"/>
+          </w:rPr>
+          <w:t>https://data.chhs.ca.gov/dataset/cdph-california-population-estimates-by-age-race_ethnicity-sex-at-local-health-jurisdiction-level</w:t>
+        </w:r>
+      </w:hyperlink>
+    </w:p>
+    <w:p>
+      <w:pPr>
+        <w:pStyle w:val="paragraph"/>
+        <w:spacing w:before="0" w:beforeAutospacing="0" w:after="0" w:afterAutospacing="0"/>
+        <w:textAlignment w:val="baseline"/>
+        <w:rPr>
+          <w:rStyle w:val="normaltextrun"/>
+          <w:rFonts w:ascii="Century Gothic" w:eastAsiaTheme="majorEastAsia" w:hAnsi="Century Gothic" w:cs="Segoe UI"/>
+        </w:rPr>
+      </w:pPr>
     </w:p>
     <w:p>
       <w:pPr>
@@ -1803,6 +1979,7 @@
           <w:rStyle w:val="normaltextrun"/>
           <w:rFonts w:ascii="Century Gothic" w:hAnsi="Century Gothic"/>
         </w:rPr>
+        <w:lastRenderedPageBreak/>
         <w:t>Methodology</w:t>
       </w:r>
       <w:bookmarkEnd w:id="4"/>
@@ -1908,7 +2085,6 @@
           <w:bCs/>
           <w:color w:val="000000"/>
         </w:rPr>
-        <w:lastRenderedPageBreak/>
         <w:t>DOF-E4 - </w:t>
       </w:r>
       <w:r>
@@ -2218,7 +2394,7 @@
         </w:rPr>
         <w:t>Detail documentation of the methods and code can be found </w:t>
       </w:r>
-      <w:hyperlink r:id="rId5" w:tgtFrame="_blank" w:history="1">
+      <w:hyperlink r:id="rId6" w:tgtFrame="_blank" w:history="1">
         <w:r>
           <w:rPr>
             <w:rStyle w:val="normaltextrun"/>
@@ -2856,6 +3032,7 @@
           <w:rFonts w:ascii="Century Gothic" w:eastAsiaTheme="majorEastAsia" w:hAnsi="Century Gothic" w:cs="Segoe UI"/>
           <w:color w:val="000000"/>
         </w:rPr>
+        <w:lastRenderedPageBreak/>
         <w:t>Adjust such that the county totals match the county totals in </w:t>
       </w:r>
       <w:r>
@@ -2904,16 +3081,7 @@
           <w:rFonts w:ascii="Century Gothic" w:eastAsiaTheme="majorEastAsia" w:hAnsi="Century Gothic" w:cs="Segoe UI"/>
           <w:color w:val="000000"/>
         </w:rPr>
-        <w:t xml:space="preserve">Note: County totals for older years should already match, except in cases where Department of Finance has made retroactive changes to their DOF E6 files. Therefore, these </w:t>
-      </w:r>
-      <w:r>
-        <w:rPr>
-          <w:rStyle w:val="normaltextrun"/>
-          <w:rFonts w:ascii="Century Gothic" w:eastAsiaTheme="majorEastAsia" w:hAnsi="Century Gothic" w:cs="Segoe UI"/>
-          <w:color w:val="000000"/>
-        </w:rPr>
-        <w:lastRenderedPageBreak/>
-        <w:t>steps are taken to ensure the county-population totals are always identical to the current DOF-E6 files. </w:t>
+        <w:t>Note: County totals for older years should already match, except in cases where Department of Finance has made retroactive changes to their DOF E6 files. Therefore, these steps are taken to ensure the county-population totals are always identical to the current DOF-E6 files. </w:t>
       </w:r>
       <w:r>
         <w:rPr>
@@ -3643,6 +3811,17 @@
         </w:rPr>
         <w:t>Output LHJ-level population estimates by age, race/ethnicity, and sex.</w:t>
       </w:r>
+    </w:p>
+    <w:p>
+      <w:pPr>
+        <w:pStyle w:val="paragraph"/>
+        <w:spacing w:before="0" w:beforeAutospacing="0" w:after="0" w:afterAutospacing="0"/>
+        <w:textAlignment w:val="baseline"/>
+        <w:rPr>
+          <w:rStyle w:val="normaltextrun"/>
+          <w:rFonts w:ascii="Century Gothic" w:hAnsi="Century Gothic" w:cs="Segoe UI"/>
+        </w:rPr>
+      </w:pPr>
       <w:r>
         <w:rPr>
           <w:rStyle w:val="eop"/>
@@ -3709,6 +3888,7 @@
           <w:rStyle w:val="normaltextrun"/>
           <w:rFonts w:ascii="Century Gothic" w:eastAsiaTheme="majorEastAsia" w:hAnsi="Century Gothic" w:cs="Segoe UI"/>
         </w:rPr>
+        <w:lastRenderedPageBreak/>
         <w:t>The </w:t>
       </w:r>
       <w:proofErr w:type="spellStart"/>
@@ -3767,13 +3947,14 @@
         <w:pStyle w:val="paragraph"/>
         <w:numPr>
           <w:ilvl w:val="0"/>
-          <w:numId w:val="21"/>
+          <w:numId w:val="33"/>
         </w:numPr>
         <w:spacing w:before="0" w:beforeAutospacing="0" w:after="0" w:afterAutospacing="0"/>
-        <w:ind w:left="1080" w:firstLine="0"/>
         <w:textAlignment w:val="baseline"/>
         <w:rPr>
           <w:rFonts w:ascii="Century Gothic" w:hAnsi="Century Gothic" w:cs="Segoe UI"/>
+          <w:sz w:val="18"/>
+          <w:szCs w:val="18"/>
         </w:rPr>
       </w:pPr>
       <w:r>
@@ -3808,13 +3989,14 @@
         <w:pStyle w:val="paragraph"/>
         <w:numPr>
           <w:ilvl w:val="0"/>
-          <w:numId w:val="22"/>
+          <w:numId w:val="33"/>
         </w:numPr>
         <w:spacing w:before="0" w:beforeAutospacing="0" w:after="0" w:afterAutospacing="0"/>
-        <w:ind w:left="1080" w:firstLine="0"/>
         <w:textAlignment w:val="baseline"/>
         <w:rPr>
           <w:rFonts w:ascii="Century Gothic" w:hAnsi="Century Gothic" w:cs="Segoe UI"/>
+          <w:sz w:val="18"/>
+          <w:szCs w:val="18"/>
         </w:rPr>
       </w:pPr>
       <w:r>
@@ -3824,7 +4006,6 @@
           <w:b/>
           <w:bCs/>
         </w:rPr>
-        <w:lastRenderedPageBreak/>
         <w:t>DOF-P3 </w:t>
       </w:r>
       <w:r>
@@ -3856,43 +4037,274 @@
         <w:pStyle w:val="paragraph"/>
         <w:numPr>
           <w:ilvl w:val="0"/>
-          <w:numId w:val="23"/>
+          <w:numId w:val="33"/>
         </w:numPr>
         <w:spacing w:before="0" w:beforeAutospacing="0" w:after="0" w:afterAutospacing="0"/>
-        <w:ind w:left="1080" w:firstLine="0"/>
+        <w:textAlignment w:val="baseline"/>
+        <w:rPr>
+          <w:rStyle w:val="normaltextrun"/>
+          <w:rFonts w:ascii="Century Gothic" w:hAnsi="Century Gothic" w:cs="Segoe UI"/>
+          <w:sz w:val="18"/>
+          <w:szCs w:val="18"/>
+        </w:rPr>
+      </w:pPr>
+      <w:r>
+        <w:rPr>
+          <w:rStyle w:val="normaltextrun"/>
+          <w:rFonts w:ascii="Century Gothic" w:eastAsiaTheme="majorEastAsia" w:hAnsi="Century Gothic" w:cs="Segoe UI"/>
+          <w:b/>
+          <w:bCs/>
+          <w:color w:val="000000"/>
+        </w:rPr>
+        <w:t>Census Decennial</w:t>
+      </w:r>
+      <w:r>
+        <w:rPr>
+          <w:rStyle w:val="normaltextrun"/>
+          <w:rFonts w:ascii="Century Gothic" w:eastAsiaTheme="majorEastAsia" w:hAnsi="Century Gothic" w:cs="Segoe UI"/>
+          <w:color w:val="000000"/>
+        </w:rPr>
+        <w:t> – Updated every ten yea</w:t>
+      </w:r>
+      <w:r>
+        <w:rPr>
+          <w:rStyle w:val="normaltextrun"/>
+          <w:rFonts w:ascii="Century Gothic" w:eastAsiaTheme="majorEastAsia" w:hAnsi="Century Gothic" w:cs="Segoe UI"/>
+          <w:color w:val="000000"/>
+        </w:rPr>
+        <w:t>rs</w:t>
+      </w:r>
+    </w:p>
+    <w:p>
+      <w:pPr>
+        <w:pStyle w:val="paragraph"/>
+        <w:spacing w:before="0" w:beforeAutospacing="0" w:after="0" w:afterAutospacing="0"/>
+        <w:ind w:left="720"/>
         <w:textAlignment w:val="baseline"/>
         <w:rPr>
           <w:rStyle w:val="eop"/>
           <w:rFonts w:ascii="Century Gothic" w:hAnsi="Century Gothic" w:cs="Segoe UI"/>
-        </w:rPr>
-      </w:pPr>
-      <w:r>
-        <w:rPr>
-          <w:rStyle w:val="normaltextrun"/>
-          <w:rFonts w:ascii="Century Gothic" w:eastAsiaTheme="majorEastAsia" w:hAnsi="Century Gothic" w:cs="Segoe UI"/>
+          <w:sz w:val="18"/>
+          <w:szCs w:val="18"/>
+        </w:rPr>
+      </w:pPr>
+      <w:r>
+        <w:rPr>
+          <w:rStyle w:val="eop"/>
+          <w:rFonts w:ascii="Century Gothic" w:eastAsiaTheme="majorEastAsia" w:hAnsi="Century Gothic" w:cs="Segoe UI"/>
+          <w:color w:val="000000"/>
+        </w:rPr>
+        <w:t> </w:t>
+      </w:r>
+    </w:p>
+    <w:p>
+      <w:pPr>
+        <w:pStyle w:val="Heading1"/>
+        <w:rPr>
+          <w:rStyle w:val="eop"/>
+          <w:rFonts w:ascii="Century Gothic" w:hAnsi="Century Gothic" w:cs="Segoe UI"/>
+        </w:rPr>
+      </w:pPr>
+      <w:bookmarkStart w:id="6" w:name="_Toc221880412"/>
+      <w:proofErr w:type="spellStart"/>
+      <w:r>
+        <w:rPr>
+          <w:rStyle w:val="eop"/>
+          <w:rFonts w:ascii="Century Gothic" w:hAnsi="Century Gothic" w:cs="Segoe UI"/>
+        </w:rPr>
+        <w:t>PopDaWG</w:t>
+      </w:r>
+      <w:proofErr w:type="spellEnd"/>
+      <w:r>
+        <w:rPr>
+          <w:rStyle w:val="eop"/>
+          <w:rFonts w:ascii="Century Gothic" w:hAnsi="Century Gothic" w:cs="Segoe UI"/>
+        </w:rPr>
+        <w:t xml:space="preserve"> LHJ ARS Population file </w:t>
+      </w:r>
+      <w:r>
+        <w:rPr>
+          <w:rStyle w:val="eop"/>
+          <w:rFonts w:ascii="Century Gothic" w:hAnsi="Century Gothic" w:cs="Segoe UI"/>
+        </w:rPr>
+        <w:t>versus</w:t>
+      </w:r>
+      <w:r>
+        <w:rPr>
+          <w:rStyle w:val="eop"/>
+          <w:rFonts w:ascii="Century Gothic" w:hAnsi="Century Gothic" w:cs="Segoe UI"/>
+        </w:rPr>
+        <w:t xml:space="preserve"> DOF P3</w:t>
+      </w:r>
+    </w:p>
+    <w:p>
+      <w:r>
+        <w:t xml:space="preserve">The </w:t>
+      </w:r>
+      <w:proofErr w:type="spellStart"/>
+      <w:r>
+        <w:rPr>
           <w:b/>
           <w:bCs/>
-          <w:color w:val="000000"/>
-        </w:rPr>
-        <w:t>Census Decennial</w:t>
-      </w:r>
-      <w:r>
-        <w:rPr>
-          <w:rStyle w:val="normaltextrun"/>
-          <w:rFonts w:ascii="Century Gothic" w:eastAsiaTheme="majorEastAsia" w:hAnsi="Century Gothic" w:cs="Segoe UI"/>
-          <w:color w:val="000000"/>
-        </w:rPr>
-        <w:t> – Updated every ten years</w:t>
-      </w:r>
-      <w:r>
-        <w:rPr>
-          <w:rStyle w:val="eop"/>
-          <w:rFonts w:ascii="Century Gothic" w:eastAsiaTheme="majorEastAsia" w:hAnsi="Century Gothic" w:cs="Segoe UI"/>
-          <w:color w:val="000000"/>
-        </w:rPr>
-        <w:t> </w:t>
-      </w:r>
-    </w:p>
+        </w:rPr>
+        <w:t>PopDaWG</w:t>
+      </w:r>
+      <w:proofErr w:type="spellEnd"/>
+      <w:r>
+        <w:rPr>
+          <w:b/>
+          <w:bCs/>
+        </w:rPr>
+        <w:t xml:space="preserve"> LHJ Age-Race-Sex</w:t>
+      </w:r>
+      <w:r>
+        <w:rPr>
+          <w:b/>
+          <w:bCs/>
+        </w:rPr>
+        <w:t xml:space="preserve"> (ARS)</w:t>
+      </w:r>
+      <w:r>
+        <w:rPr>
+          <w:b/>
+          <w:bCs/>
+        </w:rPr>
+        <w:t xml:space="preserve"> Population file</w:t>
+      </w:r>
+      <w:r>
+        <w:t xml:space="preserve"> is very similar to the </w:t>
+      </w:r>
+      <w:r>
+        <w:t>Department of Finance (</w:t>
+      </w:r>
+      <w:r>
+        <w:t>DOF</w:t>
+      </w:r>
+      <w:r>
+        <w:t>)</w:t>
+      </w:r>
+      <w:r>
+        <w:t xml:space="preserve"> P3 data,</w:t>
+      </w:r>
+      <w:r>
+        <w:t xml:space="preserve"> but includes a couple of enhancements, most notably the addition of population estimates for city-based LHJs. Below is a summer of the key differences between the </w:t>
+      </w:r>
+      <w:proofErr w:type="spellStart"/>
+      <w:r>
+        <w:t>PopDaWG</w:t>
+      </w:r>
+      <w:proofErr w:type="spellEnd"/>
+      <w:r>
+        <w:t xml:space="preserve"> LHJ ARS Population file and the DOF P3 file:</w:t>
+      </w:r>
+      <w:r>
+        <w:t xml:space="preserve"> </w:t>
+      </w:r>
+    </w:p>
+    <w:p>
+      <w:pPr>
+        <w:pStyle w:val="ListParagraph"/>
+        <w:numPr>
+          <w:ilvl w:val="0"/>
+          <w:numId w:val="34"/>
+        </w:numPr>
+      </w:pPr>
+      <w:r>
+        <w:t>DOF P3 contains county-level estimates and projections</w:t>
+      </w:r>
+      <w:r>
+        <w:t xml:space="preserve"> by age, race and ethnicity, and sex</w:t>
+      </w:r>
+      <w:r>
+        <w:t xml:space="preserve">. The </w:t>
+      </w:r>
+      <w:r>
+        <w:rPr>
+          <w:b/>
+          <w:bCs/>
+        </w:rPr>
+        <w:t>LHJ ARS file</w:t>
+      </w:r>
+      <w:r>
+        <w:t xml:space="preserve"> expands this by having population estimates/projections for:  </w:t>
+      </w:r>
+    </w:p>
+    <w:p>
+      <w:pPr>
+        <w:pStyle w:val="ListParagraph"/>
+        <w:numPr>
+          <w:ilvl w:val="1"/>
+          <w:numId w:val="34"/>
+        </w:numPr>
+      </w:pPr>
+      <w:r>
+        <w:t xml:space="preserve">All counties  </w:t>
+      </w:r>
+    </w:p>
+    <w:p>
+      <w:pPr>
+        <w:pStyle w:val="ListParagraph"/>
+        <w:numPr>
+          <w:ilvl w:val="1"/>
+          <w:numId w:val="34"/>
+        </w:numPr>
+      </w:pPr>
+      <w:r>
+        <w:t xml:space="preserve">The three city-based LHJs (Berkeley, Pasadena, Long Beach)  </w:t>
+      </w:r>
+    </w:p>
+    <w:p>
+      <w:pPr>
+        <w:pStyle w:val="ListParagraph"/>
+        <w:numPr>
+          <w:ilvl w:val="1"/>
+          <w:numId w:val="34"/>
+        </w:numPr>
+      </w:pPr>
+      <w:r>
+        <w:t xml:space="preserve">And the two health departments for counties with city health departments:  </w:t>
+      </w:r>
+    </w:p>
+    <w:p>
+      <w:pPr>
+        <w:pStyle w:val="ListParagraph"/>
+        <w:numPr>
+          <w:ilvl w:val="2"/>
+          <w:numId w:val="34"/>
+        </w:numPr>
+      </w:pPr>
+      <w:r>
+        <w:t>Alameda Health Department (Alameda County excluding Berkeley)</w:t>
+      </w:r>
+    </w:p>
+    <w:p>
+      <w:pPr>
+        <w:pStyle w:val="ListParagraph"/>
+        <w:numPr>
+          <w:ilvl w:val="2"/>
+          <w:numId w:val="34"/>
+        </w:numPr>
+      </w:pPr>
+      <w:r>
+        <w:t xml:space="preserve">Los Angeles Health Department (Los Angeles County excluding Long Beach and Pasadena)  </w:t>
+      </w:r>
+    </w:p>
+    <w:p>
+      <w:pPr>
+        <w:pStyle w:val="ListParagraph"/>
+        <w:numPr>
+          <w:ilvl w:val="0"/>
+          <w:numId w:val="34"/>
+        </w:numPr>
+      </w:pPr>
+      <w:r>
+        <w:t>The Workgroup adjusts the DOF P3 data such that the county totals match the county totals in DOF E6</w:t>
+      </w:r>
+      <w:r>
+        <w:t>.</w:t>
+      </w:r>
+    </w:p>
+    <w:p/>
     <w:p>
       <w:pPr>
         <w:pStyle w:val="Heading1"/>
@@ -3901,7 +4313,6 @@
           <w:rFonts w:ascii="Century Gothic" w:hAnsi="Century Gothic" w:cs="Segoe UI"/>
         </w:rPr>
       </w:pPr>
-      <w:bookmarkStart w:id="6" w:name="_Toc221880412"/>
       <w:r>
         <w:rPr>
           <w:rStyle w:val="eop"/>
@@ -4013,7 +4424,7 @@
         </w:rPr>
         <w:t xml:space="preserve"> [Data set]. </w:t>
       </w:r>
-      <w:hyperlink r:id="rId6" w:history="1">
+      <w:hyperlink r:id="rId7" w:history="1">
         <w:r>
           <w:rPr>
             <w:rStyle w:val="Hyperlink"/>
@@ -6734,6 +7145,119 @@
     </w:lvl>
   </w:abstractNum>
   <w:abstractNum w:abstractNumId="6" w15:restartNumberingAfterBreak="0">
+    <w:nsid w:val="1B4C6E4F"/>
+    <w:multiLevelType w:val="hybridMultilevel"/>
+    <w:tmpl w:val="2400779A"/>
+    <w:lvl w:ilvl="0" w:tplc="04090001">
+      <w:start w:val="1"/>
+      <w:numFmt w:val="bullet"/>
+      <w:lvlText w:val=""/>
+      <w:lvlJc w:val="left"/>
+      <w:pPr>
+        <w:ind w:left="720" w:hanging="360"/>
+      </w:pPr>
+      <w:rPr>
+        <w:rFonts w:ascii="Symbol" w:hAnsi="Symbol" w:hint="default"/>
+      </w:rPr>
+    </w:lvl>
+    <w:lvl w:ilvl="1" w:tplc="04090003" w:tentative="1">
+      <w:start w:val="1"/>
+      <w:numFmt w:val="bullet"/>
+      <w:lvlText w:val="o"/>
+      <w:lvlJc w:val="left"/>
+      <w:pPr>
+        <w:ind w:left="1440" w:hanging="360"/>
+      </w:pPr>
+      <w:rPr>
+        <w:rFonts w:ascii="Courier New" w:hAnsi="Courier New" w:cs="Courier New" w:hint="default"/>
+      </w:rPr>
+    </w:lvl>
+    <w:lvl w:ilvl="2" w:tplc="04090005" w:tentative="1">
+      <w:start w:val="1"/>
+      <w:numFmt w:val="bullet"/>
+      <w:lvlText w:val=""/>
+      <w:lvlJc w:val="left"/>
+      <w:pPr>
+        <w:ind w:left="2160" w:hanging="360"/>
+      </w:pPr>
+      <w:rPr>
+        <w:rFonts w:ascii="Wingdings" w:hAnsi="Wingdings" w:hint="default"/>
+      </w:rPr>
+    </w:lvl>
+    <w:lvl w:ilvl="3" w:tplc="04090001" w:tentative="1">
+      <w:start w:val="1"/>
+      <w:numFmt w:val="bullet"/>
+      <w:lvlText w:val=""/>
+      <w:lvlJc w:val="left"/>
+      <w:pPr>
+        <w:ind w:left="2880" w:hanging="360"/>
+      </w:pPr>
+      <w:rPr>
+        <w:rFonts w:ascii="Symbol" w:hAnsi="Symbol" w:hint="default"/>
+      </w:rPr>
+    </w:lvl>
+    <w:lvl w:ilvl="4" w:tplc="04090003" w:tentative="1">
+      <w:start w:val="1"/>
+      <w:numFmt w:val="bullet"/>
+      <w:lvlText w:val="o"/>
+      <w:lvlJc w:val="left"/>
+      <w:pPr>
+        <w:ind w:left="3600" w:hanging="360"/>
+      </w:pPr>
+      <w:rPr>
+        <w:rFonts w:ascii="Courier New" w:hAnsi="Courier New" w:cs="Courier New" w:hint="default"/>
+      </w:rPr>
+    </w:lvl>
+    <w:lvl w:ilvl="5" w:tplc="04090005" w:tentative="1">
+      <w:start w:val="1"/>
+      <w:numFmt w:val="bullet"/>
+      <w:lvlText w:val=""/>
+      <w:lvlJc w:val="left"/>
+      <w:pPr>
+        <w:ind w:left="4320" w:hanging="360"/>
+      </w:pPr>
+      <w:rPr>
+        <w:rFonts w:ascii="Wingdings" w:hAnsi="Wingdings" w:hint="default"/>
+      </w:rPr>
+    </w:lvl>
+    <w:lvl w:ilvl="6" w:tplc="04090001" w:tentative="1">
+      <w:start w:val="1"/>
+      <w:numFmt w:val="bullet"/>
+      <w:lvlText w:val=""/>
+      <w:lvlJc w:val="left"/>
+      <w:pPr>
+        <w:ind w:left="5040" w:hanging="360"/>
+      </w:pPr>
+      <w:rPr>
+        <w:rFonts w:ascii="Symbol" w:hAnsi="Symbol" w:hint="default"/>
+      </w:rPr>
+    </w:lvl>
+    <w:lvl w:ilvl="7" w:tplc="04090003" w:tentative="1">
+      <w:start w:val="1"/>
+      <w:numFmt w:val="bullet"/>
+      <w:lvlText w:val="o"/>
+      <w:lvlJc w:val="left"/>
+      <w:pPr>
+        <w:ind w:left="5760" w:hanging="360"/>
+      </w:pPr>
+      <w:rPr>
+        <w:rFonts w:ascii="Courier New" w:hAnsi="Courier New" w:cs="Courier New" w:hint="default"/>
+      </w:rPr>
+    </w:lvl>
+    <w:lvl w:ilvl="8" w:tplc="04090005" w:tentative="1">
+      <w:start w:val="1"/>
+      <w:numFmt w:val="bullet"/>
+      <w:lvlText w:val=""/>
+      <w:lvlJc w:val="left"/>
+      <w:pPr>
+        <w:ind w:left="6480" w:hanging="360"/>
+      </w:pPr>
+      <w:rPr>
+        <w:rFonts w:ascii="Wingdings" w:hAnsi="Wingdings" w:hint="default"/>
+      </w:rPr>
+    </w:lvl>
+  </w:abstractNum>
+  <w:abstractNum w:abstractNumId="7" w15:restartNumberingAfterBreak="0">
     <w:nsid w:val="1C647054"/>
     <w:multiLevelType w:val="multilevel"/>
     <w:tmpl w:val="A808DD62"/>
@@ -6846,7 +7370,7 @@
       </w:pPr>
     </w:lvl>
   </w:abstractNum>
-  <w:abstractNum w:abstractNumId="7" w15:restartNumberingAfterBreak="0">
+  <w:abstractNum w:abstractNumId="8" w15:restartNumberingAfterBreak="0">
     <w:nsid w:val="1D145186"/>
     <w:multiLevelType w:val="hybridMultilevel"/>
     <w:tmpl w:val="2D0EE64E"/>
@@ -6936,7 +7460,7 @@
       </w:pPr>
     </w:lvl>
   </w:abstractNum>
-  <w:abstractNum w:abstractNumId="8" w15:restartNumberingAfterBreak="0">
+  <w:abstractNum w:abstractNumId="9" w15:restartNumberingAfterBreak="0">
     <w:nsid w:val="1E3E6296"/>
     <w:multiLevelType w:val="hybridMultilevel"/>
     <w:tmpl w:val="6124262A"/>
@@ -7026,7 +7550,7 @@
       </w:pPr>
     </w:lvl>
   </w:abstractNum>
-  <w:abstractNum w:abstractNumId="9" w15:restartNumberingAfterBreak="0">
+  <w:abstractNum w:abstractNumId="10" w15:restartNumberingAfterBreak="0">
     <w:nsid w:val="20452DDB"/>
     <w:multiLevelType w:val="hybridMultilevel"/>
     <w:tmpl w:val="9392F376"/>
@@ -7116,7 +7640,7 @@
       </w:pPr>
     </w:lvl>
   </w:abstractNum>
-  <w:abstractNum w:abstractNumId="10" w15:restartNumberingAfterBreak="0">
+  <w:abstractNum w:abstractNumId="11" w15:restartNumberingAfterBreak="0">
     <w:nsid w:val="21020884"/>
     <w:multiLevelType w:val="hybridMultilevel"/>
     <w:tmpl w:val="0074A32E"/>
@@ -7206,7 +7730,7 @@
       </w:pPr>
     </w:lvl>
   </w:abstractNum>
-  <w:abstractNum w:abstractNumId="11" w15:restartNumberingAfterBreak="0">
+  <w:abstractNum w:abstractNumId="12" w15:restartNumberingAfterBreak="0">
     <w:nsid w:val="289226C7"/>
     <w:multiLevelType w:val="hybridMultilevel"/>
     <w:tmpl w:val="9C08844A"/>
@@ -7296,7 +7820,7 @@
       </w:pPr>
     </w:lvl>
   </w:abstractNum>
-  <w:abstractNum w:abstractNumId="12" w15:restartNumberingAfterBreak="0">
+  <w:abstractNum w:abstractNumId="13" w15:restartNumberingAfterBreak="0">
     <w:nsid w:val="2E5D5E26"/>
     <w:multiLevelType w:val="hybridMultilevel"/>
     <w:tmpl w:val="FAC4EE6A"/>
@@ -7386,7 +7910,7 @@
       </w:pPr>
     </w:lvl>
   </w:abstractNum>
-  <w:abstractNum w:abstractNumId="13" w15:restartNumberingAfterBreak="0">
+  <w:abstractNum w:abstractNumId="14" w15:restartNumberingAfterBreak="0">
     <w:nsid w:val="2FB3201F"/>
     <w:multiLevelType w:val="multilevel"/>
     <w:tmpl w:val="FE3AB2D4"/>
@@ -7535,7 +8059,7 @@
       </w:rPr>
     </w:lvl>
   </w:abstractNum>
-  <w:abstractNum w:abstractNumId="14" w15:restartNumberingAfterBreak="0">
+  <w:abstractNum w:abstractNumId="15" w15:restartNumberingAfterBreak="0">
     <w:nsid w:val="374A4ED9"/>
     <w:multiLevelType w:val="hybridMultilevel"/>
     <w:tmpl w:val="94226234"/>
@@ -7624,7 +8148,7 @@
       </w:pPr>
     </w:lvl>
   </w:abstractNum>
-  <w:abstractNum w:abstractNumId="15" w15:restartNumberingAfterBreak="0">
+  <w:abstractNum w:abstractNumId="16" w15:restartNumberingAfterBreak="0">
     <w:nsid w:val="392049A0"/>
     <w:multiLevelType w:val="hybridMultilevel"/>
     <w:tmpl w:val="94226234"/>
@@ -7713,7 +8237,7 @@
       </w:pPr>
     </w:lvl>
   </w:abstractNum>
-  <w:abstractNum w:abstractNumId="16" w15:restartNumberingAfterBreak="0">
+  <w:abstractNum w:abstractNumId="17" w15:restartNumberingAfterBreak="0">
     <w:nsid w:val="39B059D8"/>
     <w:multiLevelType w:val="multilevel"/>
     <w:tmpl w:val="F9B056E6"/>
@@ -7862,7 +8386,7 @@
       </w:rPr>
     </w:lvl>
   </w:abstractNum>
-  <w:abstractNum w:abstractNumId="17" w15:restartNumberingAfterBreak="0">
+  <w:abstractNum w:abstractNumId="18" w15:restartNumberingAfterBreak="0">
     <w:nsid w:val="3AE76FA1"/>
     <w:multiLevelType w:val="hybridMultilevel"/>
     <w:tmpl w:val="1F36B816"/>
@@ -7951,7 +8475,7 @@
       </w:pPr>
     </w:lvl>
   </w:abstractNum>
-  <w:abstractNum w:abstractNumId="18" w15:restartNumberingAfterBreak="0">
+  <w:abstractNum w:abstractNumId="19" w15:restartNumberingAfterBreak="0">
     <w:nsid w:val="3BAD19F9"/>
     <w:multiLevelType w:val="hybridMultilevel"/>
     <w:tmpl w:val="247C080A"/>
@@ -8041,7 +8565,7 @@
       </w:pPr>
     </w:lvl>
   </w:abstractNum>
-  <w:abstractNum w:abstractNumId="19" w15:restartNumberingAfterBreak="0">
+  <w:abstractNum w:abstractNumId="20" w15:restartNumberingAfterBreak="0">
     <w:nsid w:val="3D4E1D3A"/>
     <w:multiLevelType w:val="hybridMultilevel"/>
     <w:tmpl w:val="FAC4EE6A"/>
@@ -8131,7 +8655,7 @@
       </w:pPr>
     </w:lvl>
   </w:abstractNum>
-  <w:abstractNum w:abstractNumId="20" w15:restartNumberingAfterBreak="0">
+  <w:abstractNum w:abstractNumId="21" w15:restartNumberingAfterBreak="0">
     <w:nsid w:val="3D786556"/>
     <w:multiLevelType w:val="hybridMultilevel"/>
     <w:tmpl w:val="6124262A"/>
@@ -8221,7 +8745,7 @@
       </w:pPr>
     </w:lvl>
   </w:abstractNum>
-  <w:abstractNum w:abstractNumId="21" w15:restartNumberingAfterBreak="0">
+  <w:abstractNum w:abstractNumId="22" w15:restartNumberingAfterBreak="0">
     <w:nsid w:val="3FEA312F"/>
     <w:multiLevelType w:val="hybridMultilevel"/>
     <w:tmpl w:val="F386DE50"/>
@@ -8311,7 +8835,7 @@
       </w:pPr>
     </w:lvl>
   </w:abstractNum>
-  <w:abstractNum w:abstractNumId="22" w15:restartNumberingAfterBreak="0">
+  <w:abstractNum w:abstractNumId="23" w15:restartNumberingAfterBreak="0">
     <w:nsid w:val="482031E8"/>
     <w:multiLevelType w:val="hybridMultilevel"/>
     <w:tmpl w:val="6124262A"/>
@@ -8401,7 +8925,7 @@
       </w:pPr>
     </w:lvl>
   </w:abstractNum>
-  <w:abstractNum w:abstractNumId="23" w15:restartNumberingAfterBreak="0">
+  <w:abstractNum w:abstractNumId="24" w15:restartNumberingAfterBreak="0">
     <w:nsid w:val="4B6F28DE"/>
     <w:multiLevelType w:val="hybridMultilevel"/>
     <w:tmpl w:val="2D0EE64E"/>
@@ -8491,7 +9015,7 @@
       </w:pPr>
     </w:lvl>
   </w:abstractNum>
-  <w:abstractNum w:abstractNumId="24" w15:restartNumberingAfterBreak="0">
+  <w:abstractNum w:abstractNumId="25" w15:restartNumberingAfterBreak="0">
     <w:nsid w:val="558F233F"/>
     <w:multiLevelType w:val="multilevel"/>
     <w:tmpl w:val="D21E76C6"/>
@@ -8640,7 +9164,7 @@
       </w:rPr>
     </w:lvl>
   </w:abstractNum>
-  <w:abstractNum w:abstractNumId="25" w15:restartNumberingAfterBreak="0">
+  <w:abstractNum w:abstractNumId="26" w15:restartNumberingAfterBreak="0">
     <w:nsid w:val="577D162B"/>
     <w:multiLevelType w:val="hybridMultilevel"/>
     <w:tmpl w:val="2D0EE64E"/>
@@ -8730,7 +9254,7 @@
       </w:pPr>
     </w:lvl>
   </w:abstractNum>
-  <w:abstractNum w:abstractNumId="26" w15:restartNumberingAfterBreak="0">
+  <w:abstractNum w:abstractNumId="27" w15:restartNumberingAfterBreak="0">
     <w:nsid w:val="5CC4271F"/>
     <w:multiLevelType w:val="hybridMultilevel"/>
     <w:tmpl w:val="063A21A8"/>
@@ -8820,7 +9344,7 @@
       </w:pPr>
     </w:lvl>
   </w:abstractNum>
-  <w:abstractNum w:abstractNumId="27" w15:restartNumberingAfterBreak="0">
+  <w:abstractNum w:abstractNumId="28" w15:restartNumberingAfterBreak="0">
     <w:nsid w:val="5F1A2BC6"/>
     <w:multiLevelType w:val="hybridMultilevel"/>
     <w:tmpl w:val="6124262A"/>
@@ -8910,7 +9434,7 @@
       </w:pPr>
     </w:lvl>
   </w:abstractNum>
-  <w:abstractNum w:abstractNumId="28" w15:restartNumberingAfterBreak="0">
+  <w:abstractNum w:abstractNumId="29" w15:restartNumberingAfterBreak="0">
     <w:nsid w:val="64C701DF"/>
     <w:multiLevelType w:val="hybridMultilevel"/>
     <w:tmpl w:val="9C08844A"/>
@@ -9000,7 +9524,7 @@
       </w:pPr>
     </w:lvl>
   </w:abstractNum>
-  <w:abstractNum w:abstractNumId="29" w15:restartNumberingAfterBreak="0">
+  <w:abstractNum w:abstractNumId="30" w15:restartNumberingAfterBreak="0">
     <w:nsid w:val="685A20CD"/>
     <w:multiLevelType w:val="hybridMultilevel"/>
     <w:tmpl w:val="2D0EE64E"/>
@@ -9090,7 +9614,7 @@
       </w:pPr>
     </w:lvl>
   </w:abstractNum>
-  <w:abstractNum w:abstractNumId="30" w15:restartNumberingAfterBreak="0">
+  <w:abstractNum w:abstractNumId="31" w15:restartNumberingAfterBreak="0">
     <w:nsid w:val="6CFA6E91"/>
     <w:multiLevelType w:val="hybridMultilevel"/>
     <w:tmpl w:val="7A3CD424"/>
@@ -9180,7 +9704,7 @@
       </w:pPr>
     </w:lvl>
   </w:abstractNum>
-  <w:abstractNum w:abstractNumId="31" w15:restartNumberingAfterBreak="0">
+  <w:abstractNum w:abstractNumId="32" w15:restartNumberingAfterBreak="0">
     <w:nsid w:val="72E92408"/>
     <w:multiLevelType w:val="hybridMultilevel"/>
     <w:tmpl w:val="063A21A8"/>
@@ -9267,6 +9791,119 @@
       <w:lvlJc w:val="right"/>
       <w:pPr>
         <w:ind w:left="6480" w:hanging="180"/>
+      </w:pPr>
+    </w:lvl>
+  </w:abstractNum>
+  <w:abstractNum w:abstractNumId="33" w15:restartNumberingAfterBreak="0">
+    <w:nsid w:val="78F1188A"/>
+    <w:multiLevelType w:val="multilevel"/>
+    <w:tmpl w:val="A808DD62"/>
+    <w:lvl w:ilvl="0">
+      <w:start w:val="1"/>
+      <w:numFmt w:val="decimal"/>
+      <w:lvlText w:val="%1."/>
+      <w:lvlJc w:val="left"/>
+      <w:pPr>
+        <w:tabs>
+          <w:tab w:val="num" w:pos="720"/>
+        </w:tabs>
+        <w:ind w:left="720" w:hanging="360"/>
+      </w:pPr>
+    </w:lvl>
+    <w:lvl w:ilvl="1">
+      <w:start w:val="1"/>
+      <w:numFmt w:val="decimal"/>
+      <w:lvlText w:val="%2."/>
+      <w:lvlJc w:val="left"/>
+      <w:pPr>
+        <w:tabs>
+          <w:tab w:val="num" w:pos="1440"/>
+        </w:tabs>
+        <w:ind w:left="1440" w:hanging="360"/>
+      </w:pPr>
+    </w:lvl>
+    <w:lvl w:ilvl="2">
+      <w:start w:val="1"/>
+      <w:numFmt w:val="decimal"/>
+      <w:lvlText w:val="%3."/>
+      <w:lvlJc w:val="left"/>
+      <w:pPr>
+        <w:tabs>
+          <w:tab w:val="num" w:pos="2160"/>
+        </w:tabs>
+        <w:ind w:left="2160" w:hanging="360"/>
+      </w:pPr>
+    </w:lvl>
+    <w:lvl w:ilvl="3" w:tentative="1">
+      <w:start w:val="1"/>
+      <w:numFmt w:val="decimal"/>
+      <w:lvlText w:val="%4."/>
+      <w:lvlJc w:val="left"/>
+      <w:pPr>
+        <w:tabs>
+          <w:tab w:val="num" w:pos="2880"/>
+        </w:tabs>
+        <w:ind w:left="2880" w:hanging="360"/>
+      </w:pPr>
+    </w:lvl>
+    <w:lvl w:ilvl="4" w:tentative="1">
+      <w:start w:val="1"/>
+      <w:numFmt w:val="decimal"/>
+      <w:lvlText w:val="%5."/>
+      <w:lvlJc w:val="left"/>
+      <w:pPr>
+        <w:tabs>
+          <w:tab w:val="num" w:pos="3600"/>
+        </w:tabs>
+        <w:ind w:left="3600" w:hanging="360"/>
+      </w:pPr>
+    </w:lvl>
+    <w:lvl w:ilvl="5" w:tentative="1">
+      <w:start w:val="1"/>
+      <w:numFmt w:val="decimal"/>
+      <w:lvlText w:val="%6."/>
+      <w:lvlJc w:val="left"/>
+      <w:pPr>
+        <w:tabs>
+          <w:tab w:val="num" w:pos="4320"/>
+        </w:tabs>
+        <w:ind w:left="4320" w:hanging="360"/>
+      </w:pPr>
+    </w:lvl>
+    <w:lvl w:ilvl="6" w:tentative="1">
+      <w:start w:val="1"/>
+      <w:numFmt w:val="decimal"/>
+      <w:lvlText w:val="%7."/>
+      <w:lvlJc w:val="left"/>
+      <w:pPr>
+        <w:tabs>
+          <w:tab w:val="num" w:pos="5040"/>
+        </w:tabs>
+        <w:ind w:left="5040" w:hanging="360"/>
+      </w:pPr>
+    </w:lvl>
+    <w:lvl w:ilvl="7" w:tentative="1">
+      <w:start w:val="1"/>
+      <w:numFmt w:val="decimal"/>
+      <w:lvlText w:val="%8."/>
+      <w:lvlJc w:val="left"/>
+      <w:pPr>
+        <w:tabs>
+          <w:tab w:val="num" w:pos="5760"/>
+        </w:tabs>
+        <w:ind w:left="5760" w:hanging="360"/>
+      </w:pPr>
+    </w:lvl>
+    <w:lvl w:ilvl="8" w:tentative="1">
+      <w:start w:val="1"/>
+      <w:numFmt w:val="decimal"/>
+      <w:lvlText w:val="%9."/>
+      <w:lvlJc w:val="left"/>
+      <w:pPr>
+        <w:tabs>
+          <w:tab w:val="num" w:pos="6480"/>
+        </w:tabs>
+        <w:ind w:left="6480" w:hanging="360"/>
       </w:pPr>
     </w:lvl>
   </w:abstractNum>
@@ -9274,97 +9911,103 @@
     <w:abstractNumId w:val="2"/>
   </w:num>
   <w:num w:numId="2" w16cid:durableId="19550912">
-    <w:abstractNumId w:val="19"/>
+    <w:abstractNumId w:val="20"/>
   </w:num>
   <w:num w:numId="3" w16cid:durableId="292029953">
     <w:abstractNumId w:val="1"/>
   </w:num>
   <w:num w:numId="4" w16cid:durableId="878248390">
-    <w:abstractNumId w:val="25"/>
+    <w:abstractNumId w:val="26"/>
   </w:num>
   <w:num w:numId="5" w16cid:durableId="59325408">
-    <w:abstractNumId w:val="21"/>
+    <w:abstractNumId w:val="22"/>
   </w:num>
   <w:num w:numId="6" w16cid:durableId="1892226386">
-    <w:abstractNumId w:val="9"/>
+    <w:abstractNumId w:val="10"/>
   </w:num>
   <w:num w:numId="7" w16cid:durableId="430860882">
-    <w:abstractNumId w:val="18"/>
+    <w:abstractNumId w:val="19"/>
   </w:num>
   <w:num w:numId="8" w16cid:durableId="778570394">
     <w:abstractNumId w:val="4"/>
   </w:num>
   <w:num w:numId="9" w16cid:durableId="1618487092">
-    <w:abstractNumId w:val="10"/>
+    <w:abstractNumId w:val="11"/>
   </w:num>
   <w:num w:numId="10" w16cid:durableId="142623250">
     <w:abstractNumId w:val="5"/>
   </w:num>
   <w:num w:numId="11" w16cid:durableId="2038389700">
-    <w:abstractNumId w:val="28"/>
+    <w:abstractNumId w:val="29"/>
   </w:num>
   <w:num w:numId="12" w16cid:durableId="467625520">
-    <w:abstractNumId w:val="29"/>
+    <w:abstractNumId w:val="30"/>
   </w:num>
   <w:num w:numId="13" w16cid:durableId="1215699596">
-    <w:abstractNumId w:val="11"/>
+    <w:abstractNumId w:val="12"/>
   </w:num>
   <w:num w:numId="14" w16cid:durableId="79181568">
-    <w:abstractNumId w:val="22"/>
+    <w:abstractNumId w:val="23"/>
   </w:num>
   <w:num w:numId="15" w16cid:durableId="1210073471">
     <w:abstractNumId w:val="0"/>
   </w:num>
   <w:num w:numId="16" w16cid:durableId="1990936623">
-    <w:abstractNumId w:val="30"/>
+    <w:abstractNumId w:val="31"/>
   </w:num>
   <w:num w:numId="17" w16cid:durableId="1196312061">
-    <w:abstractNumId w:val="14"/>
+    <w:abstractNumId w:val="15"/>
   </w:num>
   <w:num w:numId="18" w16cid:durableId="1034765407">
-    <w:abstractNumId w:val="15"/>
+    <w:abstractNumId w:val="16"/>
   </w:num>
   <w:num w:numId="19" w16cid:durableId="238712772">
-    <w:abstractNumId w:val="27"/>
+    <w:abstractNumId w:val="28"/>
   </w:num>
   <w:num w:numId="20" w16cid:durableId="1011642074">
     <w:abstractNumId w:val="3"/>
   </w:num>
   <w:num w:numId="21" w16cid:durableId="1872918310">
+    <w:abstractNumId w:val="14"/>
+  </w:num>
+  <w:num w:numId="22" w16cid:durableId="120808489">
+    <w:abstractNumId w:val="17"/>
+  </w:num>
+  <w:num w:numId="23" w16cid:durableId="222907620">
+    <w:abstractNumId w:val="25"/>
+  </w:num>
+  <w:num w:numId="24" w16cid:durableId="357705636">
+    <w:abstractNumId w:val="7"/>
+  </w:num>
+  <w:num w:numId="25" w16cid:durableId="1213156036">
+    <w:abstractNumId w:val="18"/>
+  </w:num>
+  <w:num w:numId="26" w16cid:durableId="784036065">
     <w:abstractNumId w:val="13"/>
   </w:num>
-  <w:num w:numId="22" w16cid:durableId="120808489">
-    <w:abstractNumId w:val="16"/>
+  <w:num w:numId="27" w16cid:durableId="1397705949">
+    <w:abstractNumId w:val="8"/>
   </w:num>
-  <w:num w:numId="23" w16cid:durableId="222907620">
+  <w:num w:numId="28" w16cid:durableId="437263977">
     <w:abstractNumId w:val="24"/>
   </w:num>
-  <w:num w:numId="24" w16cid:durableId="357705636">
+  <w:num w:numId="29" w16cid:durableId="1753769808">
+    <w:abstractNumId w:val="21"/>
+  </w:num>
+  <w:num w:numId="30" w16cid:durableId="1330905129">
+    <w:abstractNumId w:val="9"/>
+  </w:num>
+  <w:num w:numId="31" w16cid:durableId="12152784">
+    <w:abstractNumId w:val="32"/>
+  </w:num>
+  <w:num w:numId="32" w16cid:durableId="440957089">
+    <w:abstractNumId w:val="27"/>
+  </w:num>
+  <w:num w:numId="33" w16cid:durableId="1906601978">
     <w:abstractNumId w:val="6"/>
   </w:num>
-  <w:num w:numId="25" w16cid:durableId="1213156036">
-    <w:abstractNumId w:val="17"/>
-  </w:num>
-  <w:num w:numId="26" w16cid:durableId="784036065">
-    <w:abstractNumId w:val="12"/>
-  </w:num>
-  <w:num w:numId="27" w16cid:durableId="1397705949">
-    <w:abstractNumId w:val="7"/>
-  </w:num>
-  <w:num w:numId="28" w16cid:durableId="437263977">
-    <w:abstractNumId w:val="23"/>
-  </w:num>
-  <w:num w:numId="29" w16cid:durableId="1753769808">
-    <w:abstractNumId w:val="20"/>
-  </w:num>
-  <w:num w:numId="30" w16cid:durableId="1330905129">
-    <w:abstractNumId w:val="8"/>
-  </w:num>
-  <w:num w:numId="31" w16cid:durableId="12152784">
-    <w:abstractNumId w:val="31"/>
-  </w:num>
-  <w:num w:numId="32" w16cid:durableId="440957089">
-    <w:abstractNumId w:val="26"/>
+  <w:num w:numId="34" w16cid:durableId="138690994">
+    <w:abstractNumId w:val="33"/>
   </w:num>
   <w:numIdMacAtCleanup w:val="25"/>
 </w:numbering>
@@ -9971,7 +10614,6 @@
   <w:style w:type="character" w:default="1" w:styleId="DefaultParagraphFont">
     <w:name w:val="Default Paragraph Font"/>
     <w:uiPriority w:val="1"/>
-    <w:semiHidden/>
     <w:unhideWhenUsed/>
   </w:style>
   <w:style w:type="table" w:default="1" w:styleId="TableNormal">

</xml_diff>